<commit_message>
docs(convenio): adiciona inciso VII sobre relatório complementar pós-divulgação
A Resolução TSE 23.747/2026 § 7º-A do art. 2º exige envio de relatório
complementar ao TRE em até 3 dias úteis após a divulgação, contendo
resultados numéricos consolidados + composição da amostra final por
município/gênero/idade/escolaridade/nível econômico.

A obrigação já decorre da lei e existiria independentemente do
convênio, mas explicitar no documento garante que ambas as partes
entenderam o cronograma completo (registro -5d, divulgação 0,
relatório +3d).

Co-Authored-By: Claude Opus 4.7 (1M context) <noreply@anthropic.com>
</commit_message>
<xml_diff>
--- a/docs/convenio-tv-atalaia.docx
+++ b/docs/convenio-tv-atalaia.docx
@@ -546,7 +546,31 @@
           <w:sz w:val="24"/>
           <w:szCs w:val="24"/>
         </w:rPr>
-        <w:t xml:space="preserve">fornecer à TV Atalaia a metodologia, ficha técnica, estatístico responsável (com CONRE), nome do contratante, valor, período de coleta e demais informações exigidas pelo art. 33 da Lei 9.504/1997, para inclusão na reportagem.</w:t>
+        <w:t xml:space="preserve">fornecer à TV Atalaia a metodologia, ficha técnica, estatístico responsável (com CONRE), nome do contratante, valor, período de coleta e demais informações exigidas pelo art. 33 da Lei 9.504/1997, para inclusão na reportagem;</w:t>
+      </w:r>
+    </w:p>
+    <w:p>
+      <w:pPr>
+        <w:spacing w:after="120" w:line="320"/>
+        <w:jc w:val="both"/>
+      </w:pPr>
+      <w:r>
+        <w:rPr>
+          <w:rFonts w:ascii="Times New Roman" w:cs="Times New Roman" w:eastAsia="Times New Roman" w:hAnsi="Times New Roman"/>
+          <w:b/>
+          <w:bCs/>
+          <w:sz w:val="24"/>
+          <w:szCs w:val="24"/>
+        </w:rPr>
+        <w:t xml:space="preserve">VII. </w:t>
+      </w:r>
+      <w:r>
+        <w:rPr>
+          <w:rFonts w:ascii="Times New Roman" w:cs="Times New Roman" w:eastAsia="Times New Roman" w:hAnsi="Times New Roman"/>
+          <w:sz w:val="24"/>
+          <w:szCs w:val="24"/>
+        </w:rPr>
+        <w:t xml:space="preserve">encaminhar ao Tribunal Regional Eleitoral de Sergipe, em até 3 (três) dias úteis após a divulgação no telejornal, o relatório complementar previsto no § 7º-A do art. 2º da Resolução TSE nº 23.747/2026, contendo os resultados numéricos consolidados, a composição da amostra final por município, gênero, faixa etária, grau de instrução e nível econômico, e demais elementos exigidos para fins de auditoria e fiscalização eleitoral — sendo cópia disponibilizada à TV Atalaia para arquivo editorial mediante solicitação.</w:t>
       </w:r>
     </w:p>
     <w:p>

</xml_diff>

<commit_message>
docs(convenio): preenche representante da TV Atalaia
- Diretor-Geral: Walter do Prado Franco
- CPF: 003.685.395-04
- E-mail oficial: amalta@sisatalaia.com.br

Regenera .docx e .pdf (Chrome headless A4 Times 12pt). Versiona
também o PDF da explicação PesqEle gerada para o advogado.

Pendência única do convênio: 2 testemunhas (nome + CPF).

Co-Authored-By: Claude Opus 4.7 (1M context) <noreply@anthropic.com>
</commit_message>
<xml_diff>
--- a/docs/convenio-tv-atalaia.docx
+++ b/docs/convenio-tv-atalaia.docx
@@ -149,25 +149,25 @@
           <w:sz w:val="24"/>
           <w:szCs w:val="24"/>
         </w:rPr>
-        <w:t xml:space="preserve">sociedade empresária limitada, inscrita no CNPJ sob o nº 13.079.397/0001-09, com sede na Rua Cláudio Batista, 122, Santo Antônio, Aracaju/SE — CEP 49.060-100, dedicada à atividade de televisão aberta (CNAE 6021-7/00), afiliada à Record TV no Estado de Sergipe, neste ato representada por seu(sua) Diretor(a)-Geral, Sr(a). </w:t>
-      </w:r>
-      <w:r>
-        <w:rPr>
-          <w:rFonts w:ascii="Times New Roman" w:cs="Times New Roman" w:eastAsia="Times New Roman" w:hAnsi="Times New Roman"/>
-          <w:b/>
-          <w:bCs/>
-          <w:sz w:val="24"/>
-          <w:szCs w:val="24"/>
-        </w:rPr>
-        <w:t xml:space="preserve">_____________________________________</w:t>
-      </w:r>
-      <w:r>
-        <w:rPr>
-          <w:rFonts w:ascii="Times New Roman" w:cs="Times New Roman" w:eastAsia="Times New Roman" w:hAnsi="Times New Roman"/>
-          <w:sz w:val="24"/>
-          <w:szCs w:val="24"/>
-        </w:rPr>
-        <w:t xml:space="preserve">, inscrito(a) no CPF sob o nº ________________________, doravante denominada </w:t>
+        <w:t xml:space="preserve">sociedade empresária limitada, inscrita no CNPJ sob o nº 13.079.397/0001-09, com sede na Rua Cláudio Batista, 122, Santo Antônio, Aracaju/SE — CEP 49.060-100, dedicada à atividade de televisão aberta (CNAE 6021-7/00), afiliada à Record TV no Estado de Sergipe, neste ato representada por seu Diretor-Geral, </w:t>
+      </w:r>
+      <w:r>
+        <w:rPr>
+          <w:rFonts w:ascii="Times New Roman" w:cs="Times New Roman" w:eastAsia="Times New Roman" w:hAnsi="Times New Roman"/>
+          <w:b/>
+          <w:bCs/>
+          <w:sz w:val="24"/>
+          <w:szCs w:val="24"/>
+        </w:rPr>
+        <w:t xml:space="preserve">Sr. Walter do Prado Franco</w:t>
+      </w:r>
+      <w:r>
+        <w:rPr>
+          <w:rFonts w:ascii="Times New Roman" w:cs="Times New Roman" w:eastAsia="Times New Roman" w:hAnsi="Times New Roman"/>
+          <w:sz w:val="24"/>
+          <w:szCs w:val="24"/>
+        </w:rPr>
+        <w:t xml:space="preserve">, inscrito no CPF sob o nº 003.685.395-04, doravante denominada </w:t>
       </w:r>
       <w:r>
         <w:rPr>
@@ -1334,7 +1334,7 @@
           <w:sz w:val="24"/>
           <w:szCs w:val="24"/>
         </w:rPr>
-        <w:t xml:space="preserve">Rua Cláudio Batista, 122, Santo Antônio, Aracaju/SE — CEP 49.060-100 · e-mail: ________________________________________</w:t>
+        <w:t xml:space="preserve">Rua Cláudio Batista, 122, Santo Antônio, Aracaju/SE — CEP 49.060-100 · e-mail: amalta@sisatalaia.com.br</w:t>
       </w:r>
     </w:p>
     <w:p>
@@ -1586,7 +1586,7 @@
           <w:sz w:val="24"/>
           <w:szCs w:val="24"/>
         </w:rPr>
-        <w:t xml:space="preserve">[NOME COMPLETO DO REPRESENTANTE LEGAL]</w:t>
+        <w:t xml:space="preserve">WALTER DO PRADO FRANCO</w:t>
       </w:r>
     </w:p>
     <w:p>
@@ -1600,7 +1600,7 @@
           <w:sz w:val="24"/>
           <w:szCs w:val="24"/>
         </w:rPr>
-        <w:t xml:space="preserve">Diretor(a)-Geral · Televisão Atalaia Ltda</w:t>
+        <w:t xml:space="preserve">Diretor-Geral · Televisão Atalaia Ltda</w:t>
       </w:r>
     </w:p>
     <w:p>
@@ -1614,7 +1614,7 @@
           <w:sz w:val="24"/>
           <w:szCs w:val="24"/>
         </w:rPr>
-        <w:t xml:space="preserve">CPF ________________________</w:t>
+        <w:t xml:space="preserve">CPF 003.685.395-04</w:t>
       </w:r>
     </w:p>
     <w:p>

</xml_diff>